<commit_message>
docs(desa-cantik): update SOP Permintaan Data 2026 & rule dual-channel delivery
</commit_message>
<xml_diff>
--- a/kegiatan/desa-cantik/2026/pasir-palembang/sop-permintaan-data-pasir-palembang-2026.docx
+++ b/kegiatan/desa-cantik/2026/pasir-palembang/sop-permintaan-data-pasir-palembang-2026.docx
@@ -39,13 +39,13 @@
         </w:pict>
       </w:r>
     </w:p>
-    <w:bookmarkStart w:id="20" w:name="latar-belakang"/>
+    <w:bookmarkStart w:id="20" w:name="latar-belakang-prinsip-layanan-cepat"/>
     <w:p>
       <w:pPr>
         <w:pStyle w:val="Heading3"/>
       </w:pPr>
       <w:r>
-        <w:t xml:space="preserve">1. Latar Belakang</w:t>
+        <w:t xml:space="preserve">1. Latar Belakang &amp; Prinsip Layanan Cepat</w:t>
       </w:r>
     </w:p>
     <w:p>
@@ -53,7 +53,68 @@
         <w:pStyle w:val="FirstParagraph"/>
       </w:pPr>
       <w:r>
-        <w:t xml:space="preserve">Dalam rangka mewujudkan tata kelola Satu Data Indonesia (SDI) di tingkat desa serta mendukung keterbukaan informasi publik, Pemerintah Desa Pasir Palembang bersama Badan Pusat Statistik (BPS) Kabupaten Mempawah menyusun Standar Operasional Prosedur (SOP) Permintaan dan Pemanfaatan Data. SOP ini mengatur mekanisme aksesibilitas data bagi masyarakat, akademisi, perangkat daerah, dan pemangku kepentingan secara transparan, akuntabel, dan cepat.</w:t>
+        <w:t xml:space="preserve">Dalam rangka mewujudkan tata kelola Satu Data Indonesia (SDI) di tingkat desa serta mendukung keterbukaan informasi publik, Pemerintah Desa Pasir Palembang bersama Badan Pusat Statistik (BPS) Kabupaten Mempawah menyusun Standar Operasional Prosedur (SOP) Permintaan dan Pemanfaatan Data. Layanan ini menerapkan prinsip</w:t>
+      </w:r>
+      <w:r>
+        <w:t xml:space="preserve"> </w:t>
+      </w:r>
+      <w:r>
+        <w:rPr>
+          <w:b/>
+          <w:bCs/>
+        </w:rPr>
+        <w:t xml:space="preserve">pelayanan cepat, ringkas, dan bebas hambatan birokrasi</w:t>
+      </w:r>
+      <w:r>
+        <w:t xml:space="preserve">: permohonan data statistik yang bersifat</w:t>
+      </w:r>
+      <w:r>
+        <w:t xml:space="preserve"> </w:t>
+      </w:r>
+      <w:r>
+        <w:rPr>
+          <w:b/>
+          <w:bCs/>
+        </w:rPr>
+        <w:t xml:space="preserve">agregat (non-</w:t>
+      </w:r>
+      <w:r>
+        <w:rPr>
+          <w:b/>
+          <w:bCs/>
+          <w:i/>
+          <w:iCs/>
+        </w:rPr>
+        <w:t xml:space="preserve">by name by address</w:t>
+      </w:r>
+      <w:r>
+        <w:rPr>
+          <w:b/>
+          <w:bCs/>
+        </w:rPr>
+        <w:t xml:space="preserve">)</w:t>
+      </w:r>
+      <w:r>
+        <w:t xml:space="preserve"> </w:t>
+      </w:r>
+      <w:r>
+        <w:t xml:space="preserve">langsung diproses dan dirilis secara mandiri oleh</w:t>
+      </w:r>
+      <w:r>
+        <w:t xml:space="preserve"> </w:t>
+      </w:r>
+      <w:r>
+        <w:rPr>
+          <w:b/>
+          <w:bCs/>
+        </w:rPr>
+        <w:t xml:space="preserve">Petugas Agen Statistik Desa</w:t>
+      </w:r>
+      <w:r>
+        <w:t xml:space="preserve"> </w:t>
+      </w:r>
+      <w:r>
+        <w:t xml:space="preserve">tanpa memerlukan tanda tangan basah Kepala Desa Pasir Palembang.</w:t>
       </w:r>
     </w:p>
     <w:p>
@@ -64,13 +125,13 @@
       </w:r>
     </w:p>
     <w:bookmarkEnd w:id="20"/>
-    <w:bookmarkStart w:id="21" w:name="sumber-data-basis-data-terpadu"/>
+    <w:bookmarkStart w:id="21" w:name="Xf303658d46ecd2ec97cb05ebb24c35aa58a9abe"/>
     <w:p>
       <w:pPr>
         <w:pStyle w:val="Heading3"/>
       </w:pPr>
       <w:r>
-        <w:t xml:space="preserve">2. Sumber Data &amp; Basis Data Terpadu</w:t>
+        <w:t xml:space="preserve">2. Sumber Data &amp; Batasan Data Terpadu (Hanya Non-BNBA)</w:t>
       </w:r>
     </w:p>
     <w:p>
@@ -78,99 +139,68 @@
         <w:pStyle w:val="FirstParagraph"/>
       </w:pPr>
       <w:r>
-        <w:t xml:space="preserve">Data yang dapat diakses bersumber dari basis data hasil sensus dan pendataan potensi kewilayahan Program Desa Cantik 2026:</w:t>
+        <w:t xml:space="preserve">Data yang dapat diakses bersumber dari basis data hasil sensus dan pendataan potensi kewilayahan Program Desa Cantik 2026, dengan batasan ketat</w:t>
       </w:r>
       <w:r>
         <w:t xml:space="preserve"> </w:t>
       </w:r>
       <w:r>
-        <w:t xml:space="preserve">*</w:t>
-      </w:r>
-      <w:r>
-        <w:t xml:space="preserve"> </w:t>
-      </w:r>
-      <w:r>
-        <w:rPr>
-          <w:b/>
-          <w:bCs/>
-        </w:rPr>
-        <w:t xml:space="preserve">Basis Data RT &amp; Demografi (</w:t>
-      </w:r>
-      <w:r>
-        <w:rPr>
-          <w:rStyle w:val="VerbatimChar"/>
-          <w:b/>
-          <w:bCs/>
-        </w:rPr>
-        <w:t xml:space="preserve">Sheet1</w:t>
-      </w:r>
-      <w:r>
-        <w:rPr>
-          <w:b/>
-          <w:bCs/>
-        </w:rPr>
-        <w:t xml:space="preserve"> </w:t>
-      </w:r>
-      <w:r>
-        <w:rPr>
-          <w:b/>
-          <w:bCs/>
-        </w:rPr>
-        <w:t xml:space="preserve">/ AppSheet)</w:t>
-      </w:r>
-      <w:r>
-        <w:t xml:space="preserve">: Karakteristik penduduk (gender, rasio jenis kelamin), rumah tangga (KK), tingkat pendidikan, kepemilikan dokumen adminduk/BPJS, status ketenagakerjaan, kegiatan UMKM, dan sebaran penerima bantuan sosial (PKH, BPNT, BST, BLT).</w:t>
-      </w:r>
-      <w:r>
-        <w:t xml:space="preserve"> </w:t>
-      </w:r>
-      <w:r>
-        <w:t xml:space="preserve">*</w:t>
-      </w:r>
-      <w:r>
-        <w:t xml:space="preserve"> </w:t>
-      </w:r>
-      <w:r>
-        <w:rPr>
-          <w:b/>
-          <w:bCs/>
-        </w:rPr>
-        <w:t xml:space="preserve">Basis Data Fasilitas (</w:t>
-      </w:r>
-      <w:r>
-        <w:rPr>
-          <w:rStyle w:val="VerbatimChar"/>
-          <w:b/>
-          <w:bCs/>
-        </w:rPr>
-        <w:t xml:space="preserve">Sheet4</w:t>
-      </w:r>
-      <w:r>
-        <w:rPr>
-          <w:b/>
-          <w:bCs/>
-        </w:rPr>
-        <w:t xml:space="preserve"> </w:t>
-      </w:r>
-      <w:r>
-        <w:rPr>
-          <w:b/>
-          <w:bCs/>
-        </w:rPr>
-        <w:t xml:space="preserve">/ AppSheet)</w:t>
-      </w:r>
-      <w:r>
-        <w:t xml:space="preserve">: Pemetaan geospasial sarana peribadatan, pendidikan, kesehatan, fasilitas ekonomi, pemerintahan, kondisi fisik bangunan, jalan, listrik, dan jaringan telekomunikasi.</w:t>
-      </w:r>
-      <w:r>
-        <w:t xml:space="preserve"> </w:t>
-      </w:r>
-      <w:r>
-        <w:t xml:space="preserve">*</w:t>
-      </w:r>
-      <w:r>
-        <w:t xml:space="preserve"> </w:t>
-      </w:r>
+        <w:rPr>
+          <w:b/>
+          <w:bCs/>
+        </w:rPr>
+        <w:t xml:space="preserve">hanya menyajikan data agregat</w:t>
+      </w:r>
+      <w:r>
+        <w:t xml:space="preserve">:</w:t>
+      </w:r>
+    </w:p>
+    <w:p>
+      <w:pPr>
+        <w:pStyle w:val="Compact"/>
+        <w:numPr>
+          <w:ilvl w:val="0"/>
+          <w:numId w:val="1001"/>
+        </w:numPr>
+      </w:pPr>
+      <w:r>
+        <w:rPr>
+          <w:b/>
+          <w:bCs/>
+        </w:rPr>
+        <w:t xml:space="preserve">Basis Data Kependudukan &amp; Sosial Ekonomi</w:t>
+      </w:r>
+      <w:r>
+        <w:t xml:space="preserve">: Rekapitulasi jumlah penduduk (gender, rasio jenis kelamin), jumlah kepala keluarga (KK), sebaran tingkat pendidikan, kepemilikan dokumen administrasi kependudukan/BPJS, status ketenagakerjaan, kelompok UMKM, dan sebaran agregat penerima bantuan sosial (PKH, BPNT, BST, BLT).</w:t>
+      </w:r>
+    </w:p>
+    <w:p>
+      <w:pPr>
+        <w:pStyle w:val="Compact"/>
+        <w:numPr>
+          <w:ilvl w:val="0"/>
+          <w:numId w:val="1001"/>
+        </w:numPr>
+      </w:pPr>
+      <w:r>
+        <w:rPr>
+          <w:b/>
+          <w:bCs/>
+        </w:rPr>
+        <w:t xml:space="preserve">Basis Data Sarana, Prasarana, &amp; Potensi Wilayah</w:t>
+      </w:r>
+      <w:r>
+        <w:t xml:space="preserve">: Pemetaan geospasial sarana peribadatan, pendidikan, kesehatan, fasilitas ekonomi, perkantoran pemerintah, kondisi fisik lingkungan, jalan, penerangan, dan jaringan telekomunikasi.</w:t>
+      </w:r>
+    </w:p>
+    <w:p>
+      <w:pPr>
+        <w:pStyle w:val="Compact"/>
+        <w:numPr>
+          <w:ilvl w:val="0"/>
+          <w:numId w:val="1001"/>
+        </w:numPr>
+      </w:pPr>
       <w:r>
         <w:rPr>
           <w:b/>
@@ -206,6 +236,51 @@
       </w:r>
       <w:r>
         <w:t xml:space="preserve">, Monografi Desa, dan Infografis Statistik Demografi format resolusi tinggi (HD).</w:t>
+      </w:r>
+    </w:p>
+    <w:p>
+      <w:pPr>
+        <w:pStyle w:val="Compact"/>
+        <w:numPr>
+          <w:ilvl w:val="0"/>
+          <w:numId w:val="1001"/>
+        </w:numPr>
+      </w:pPr>
+      <w:r>
+        <w:rPr>
+          <w:b/>
+          <w:bCs/>
+        </w:rPr>
+        <w:t xml:space="preserve">Pemberitahuan Khusus</w:t>
+      </w:r>
+      <w:r>
+        <w:t xml:space="preserve">: Seluruh data individu perorangan/keluarga (</w:t>
+      </w:r>
+      <w:r>
+        <w:rPr>
+          <w:i/>
+          <w:iCs/>
+        </w:rPr>
+        <w:t xml:space="preserve">by name by address</w:t>
+      </w:r>
+      <w:r>
+        <w:t xml:space="preserve">)</w:t>
+      </w:r>
+      <w:r>
+        <w:t xml:space="preserve"> </w:t>
+      </w:r>
+      <w:r>
+        <w:rPr>
+          <w:b/>
+          <w:bCs/>
+        </w:rPr>
+        <w:t xml:space="preserve">tidak dapat dimohonkan</w:t>
+      </w:r>
+      <w:r>
+        <w:t xml:space="preserve"> </w:t>
+      </w:r>
+      <w:r>
+        <w:t xml:space="preserve">demi mematuhi prinsip kerahasiaan statistik dan privasi warga.</w:t>
       </w:r>
     </w:p>
     <w:p>
@@ -429,7 +504,7 @@
                 <w:b/>
                 <w:bCs/>
               </w:rPr>
-              <w:t xml:space="preserve">Jalur 2: Layanan Fasilitasi Khusus</w:t>
+              <w:t xml:space="preserve">Jalur 2: Layanan Fasilitasi Cepat</w:t>
             </w:r>
             <w:r>
               <w:t xml:space="preserve"> </w:t>
@@ -478,7 +553,7 @@
               <w:jc w:val="left"/>
             </w:pPr>
             <w:r>
-              <w:t xml:space="preserve">Instansi resmi, riset khusus, atau pemohon data disagregasi/legalisir</w:t>
+              <w:t xml:space="preserve">Instansi pemerintah, mahasiswa, perencana, atau pemohon data disagregasi agregat</w:t>
             </w:r>
           </w:p>
         </w:tc>
@@ -494,7 +569,7 @@
                 <w:b/>
                 <w:bCs/>
               </w:rPr>
-              <w:t xml:space="preserve">Maksimal 1 Hari Kerja</w:t>
+              <w:t xml:space="preserve">15 s.d. 30 Menit</w:t>
             </w:r>
           </w:p>
         </w:tc>
@@ -506,7 +581,7 @@
               <w:jc w:val="left"/>
             </w:pPr>
             <w:r>
-              <w:t xml:space="preserve">Berkas Data Rekapitulasi Resmi bertanda tangan Kepala Desa Pasir Palembang</w:t>
+              <w:t xml:space="preserve">Lembar Rekapitulasi Data Agregat Terverifikasi Petugas Agen Statistik Desa</w:t>
             </w:r>
           </w:p>
         </w:tc>
@@ -561,55 +636,15 @@
         <w:pStyle w:val="Compact"/>
         <w:numPr>
           <w:ilvl w:val="0"/>
-          <w:numId w:val="1001"/>
-        </w:numPr>
-      </w:pPr>
-      <w:r>
-        <w:rPr>
-          <w:b/>
-          <w:bCs/>
-        </w:rPr>
-        <w:t xml:space="preserve">Akses Portal Website Resmi</w:t>
-      </w:r>
-      <w:r>
-        <w:t xml:space="preserve">:</w:t>
-      </w:r>
-    </w:p>
-    <w:p>
-      <w:pPr>
-        <w:pStyle w:val="Compact"/>
-        <w:numPr>
-          <w:ilvl w:val="1"/>
           <w:numId w:val="1002"/>
         </w:numPr>
       </w:pPr>
       <w:r>
-        <w:t xml:space="preserve">Pemohon mengunjungi portal web Desa Cantik:</w:t>
-      </w:r>
-      <w:r>
-        <w:t xml:space="preserve"> </w:t>
-      </w:r>
-      <w:r>
-        <w:rPr>
-          <w:rStyle w:val="VerbatimChar"/>
-        </w:rPr>
-        <w:t xml:space="preserve">https://desa-sm.dvlp.asia/desa-cantik/desapasirpalembang</w:t>
-      </w:r>
-    </w:p>
-    <w:p>
-      <w:pPr>
-        <w:pStyle w:val="Compact"/>
-        <w:numPr>
-          <w:ilvl w:val="0"/>
-          <w:numId w:val="1001"/>
-        </w:numPr>
-      </w:pPr>
-      <w:r>
-        <w:rPr>
-          <w:b/>
-          <w:bCs/>
-        </w:rPr>
-        <w:t xml:space="preserve">Pilih Menu Layanan dan Unduh Mandiri</w:t>
+        <w:rPr>
+          <w:b/>
+          <w:bCs/>
+        </w:rPr>
+        <w:t xml:space="preserve">Akses Portal Website Resmi</w:t>
       </w:r>
       <w:r>
         <w:t xml:space="preserve">:</w:t>
@@ -624,164 +659,16 @@
         </w:numPr>
       </w:pPr>
       <w:r>
-        <w:rPr>
-          <w:b/>
-          <w:bCs/>
-        </w:rPr>
-        <w:t xml:space="preserve">Dataset Excel (SDI)</w:t>
-      </w:r>
-      <w:r>
-        <w:t xml:space="preserve">: Masuk ke section</w:t>
+        <w:t xml:space="preserve">Pemohon mengunjungi portal web Desa Cantik:</w:t>
       </w:r>
       <w:r>
         <w:t xml:space="preserve"> </w:t>
       </w:r>
       <w:r>
         <w:rPr>
-          <w:i/>
-          <w:iCs/>
-        </w:rPr>
-        <w:t xml:space="preserve">Daftar Potensi RT</w:t>
-      </w:r>
-      <w:r>
-        <w:t xml:space="preserve">, lalu klik tombol</w:t>
-      </w:r>
-      <w:r>
-        <w:t xml:space="preserve"> </w:t>
-      </w:r>
-      <w:r>
-        <w:rPr>
-          <w:b/>
-          <w:bCs/>
-        </w:rPr>
-        <w:t xml:space="preserve">“Unduh Data Tabel (Excel)”</w:t>
-      </w:r>
-      <w:r>
-        <w:t xml:space="preserve"> </w:t>
-      </w:r>
-      <w:r>
-        <w:t xml:space="preserve">untuk mendapatkan file spreadsheet lengkap (</w:t>
-      </w:r>
-      <w:r>
-        <w:rPr>
           <w:rStyle w:val="VerbatimChar"/>
         </w:rPr>
-        <w:t xml:space="preserve">.xlsx</w:t>
-      </w:r>
-      <w:r>
-        <w:t xml:space="preserve">).</w:t>
-      </w:r>
-    </w:p>
-    <w:p>
-      <w:pPr>
-        <w:pStyle w:val="Compact"/>
-        <w:numPr>
-          <w:ilvl w:val="1"/>
-          <w:numId w:val="1003"/>
-        </w:numPr>
-      </w:pPr>
-      <w:r>
-        <w:rPr>
-          <w:b/>
-          <w:bCs/>
-        </w:rPr>
-        <w:t xml:space="preserve">Buku Publikasi Digital</w:t>
-      </w:r>
-      <w:r>
-        <w:t xml:space="preserve">: Masuk ke section</w:t>
-      </w:r>
-      <w:r>
-        <w:t xml:space="preserve"> </w:t>
-      </w:r>
-      <w:r>
-        <w:rPr>
-          <w:i/>
-          <w:iCs/>
-        </w:rPr>
-        <w:t xml:space="preserve">Publikasi &amp; Bukti Dukung</w:t>
-      </w:r>
-      <w:r>
-        <w:t xml:space="preserve">, klik</w:t>
-      </w:r>
-      <w:r>
-        <w:t xml:space="preserve"> </w:t>
-      </w:r>
-      <w:r>
-        <w:rPr>
-          <w:b/>
-          <w:bCs/>
-        </w:rPr>
-        <w:t xml:space="preserve">“Unduh Publikasi”</w:t>
-      </w:r>
-      <w:r>
-        <w:t xml:space="preserve"> </w:t>
-      </w:r>
-      <w:r>
-        <w:t xml:space="preserve">untuk mengunduh naskah PDF resmi Desa Dalam Angka atau Potensi Desa.</w:t>
-      </w:r>
-    </w:p>
-    <w:p>
-      <w:pPr>
-        <w:pStyle w:val="Compact"/>
-        <w:numPr>
-          <w:ilvl w:val="1"/>
-          <w:numId w:val="1003"/>
-        </w:numPr>
-      </w:pPr>
-      <w:r>
-        <w:rPr>
-          <w:b/>
-          <w:bCs/>
-        </w:rPr>
-        <w:t xml:space="preserve">Monografi &amp; Infografis</w:t>
-      </w:r>
-      <w:r>
-        <w:t xml:space="preserve">: Masuk ke section</w:t>
-      </w:r>
-      <w:r>
-        <w:t xml:space="preserve"> </w:t>
-      </w:r>
-      <w:r>
-        <w:rPr>
-          <w:i/>
-          <w:iCs/>
-        </w:rPr>
-        <w:t xml:space="preserve">Produk Statistik &amp; SOP</w:t>
-      </w:r>
-      <w:r>
-        <w:t xml:space="preserve">, klik</w:t>
-      </w:r>
-      <w:r>
-        <w:t xml:space="preserve"> </w:t>
-      </w:r>
-      <w:r>
-        <w:rPr>
-          <w:b/>
-          <w:bCs/>
-        </w:rPr>
-        <w:t xml:space="preserve">“Unduh Monografi”</w:t>
-      </w:r>
-      <w:r>
-        <w:t xml:space="preserve"> </w:t>
-      </w:r>
-      <w:r>
-        <w:t xml:space="preserve">atau</w:t>
-      </w:r>
-      <w:r>
-        <w:t xml:space="preserve"> </w:t>
-      </w:r>
-      <w:r>
-        <w:rPr>
-          <w:b/>
-          <w:bCs/>
-        </w:rPr>
-        <w:t xml:space="preserve">“Unduh Versi HD”</w:t>
-      </w:r>
-      <w:r>
-        <w:t xml:space="preserve"> </w:t>
-      </w:r>
-      <w:r>
-        <w:t xml:space="preserve">untuk materi infografis visual.</w:t>
+        <w:t xml:space="preserve">https://desa-sm.dvlp.asia/desa-cantik/desapasirpalembang</w:t>
       </w:r>
     </w:p>
     <w:p>
@@ -789,7 +676,7 @@
         <w:pStyle w:val="Compact"/>
         <w:numPr>
           <w:ilvl w:val="0"/>
-          <w:numId w:val="1001"/>
+          <w:numId w:val="1002"/>
         </w:numPr>
       </w:pPr>
       <w:r>
@@ -797,7 +684,7 @@
           <w:b/>
           <w:bCs/>
         </w:rPr>
-        <w:t xml:space="preserve">Integrasi Open API (Bagi Pengembang / Sistem Eksternal)</w:t>
+        <w:t xml:space="preserve">Pilih Menu Layanan dan Unduh Mandiri</w:t>
       </w:r>
       <w:r>
         <w:t xml:space="preserve">:</w:t>
@@ -812,7 +699,195 @@
         </w:numPr>
       </w:pPr>
       <w:r>
-        <w:t xml:space="preserve">Akses data terstruktur via REST API (JSON):</w:t>
+        <w:rPr>
+          <w:b/>
+          <w:bCs/>
+        </w:rPr>
+        <w:t xml:space="preserve">Dataset Excel (SDI)</w:t>
+      </w:r>
+      <w:r>
+        <w:t xml:space="preserve">: Masuk ke section</w:t>
+      </w:r>
+      <w:r>
+        <w:t xml:space="preserve"> </w:t>
+      </w:r>
+      <w:r>
+        <w:rPr>
+          <w:i/>
+          <w:iCs/>
+        </w:rPr>
+        <w:t xml:space="preserve">Daftar Potensi RT</w:t>
+      </w:r>
+      <w:r>
+        <w:t xml:space="preserve">, lalu klik tombol</w:t>
+      </w:r>
+      <w:r>
+        <w:t xml:space="preserve"> </w:t>
+      </w:r>
+      <w:r>
+        <w:rPr>
+          <w:b/>
+          <w:bCs/>
+        </w:rPr>
+        <w:t xml:space="preserve">“Unduh Data Tabel (Excel)”</w:t>
+      </w:r>
+      <w:r>
+        <w:t xml:space="preserve"> </w:t>
+      </w:r>
+      <w:r>
+        <w:t xml:space="preserve">untuk mendapatkan file spreadsheet lengkap (</w:t>
+      </w:r>
+      <w:r>
+        <w:rPr>
+          <w:rStyle w:val="VerbatimChar"/>
+        </w:rPr>
+        <w:t xml:space="preserve">.xlsx</w:t>
+      </w:r>
+      <w:r>
+        <w:t xml:space="preserve">).</w:t>
+      </w:r>
+    </w:p>
+    <w:p>
+      <w:pPr>
+        <w:pStyle w:val="Compact"/>
+        <w:numPr>
+          <w:ilvl w:val="1"/>
+          <w:numId w:val="1004"/>
+        </w:numPr>
+      </w:pPr>
+      <w:r>
+        <w:rPr>
+          <w:b/>
+          <w:bCs/>
+        </w:rPr>
+        <w:t xml:space="preserve">Buku Publikasi Digital</w:t>
+      </w:r>
+      <w:r>
+        <w:t xml:space="preserve">: Masuk ke section</w:t>
+      </w:r>
+      <w:r>
+        <w:t xml:space="preserve"> </w:t>
+      </w:r>
+      <w:r>
+        <w:rPr>
+          <w:i/>
+          <w:iCs/>
+        </w:rPr>
+        <w:t xml:space="preserve">Publikasi &amp; Bukti Dukung</w:t>
+      </w:r>
+      <w:r>
+        <w:t xml:space="preserve">, klik</w:t>
+      </w:r>
+      <w:r>
+        <w:t xml:space="preserve"> </w:t>
+      </w:r>
+      <w:r>
+        <w:rPr>
+          <w:b/>
+          <w:bCs/>
+        </w:rPr>
+        <w:t xml:space="preserve">“Unduh Publikasi”</w:t>
+      </w:r>
+      <w:r>
+        <w:t xml:space="preserve"> </w:t>
+      </w:r>
+      <w:r>
+        <w:t xml:space="preserve">untuk mengunduh naskah PDF resmi Desa Dalam Angka atau Potensi Desa.</w:t>
+      </w:r>
+    </w:p>
+    <w:p>
+      <w:pPr>
+        <w:pStyle w:val="Compact"/>
+        <w:numPr>
+          <w:ilvl w:val="1"/>
+          <w:numId w:val="1004"/>
+        </w:numPr>
+      </w:pPr>
+      <w:r>
+        <w:rPr>
+          <w:b/>
+          <w:bCs/>
+        </w:rPr>
+        <w:t xml:space="preserve">Monografi &amp; Infografis</w:t>
+      </w:r>
+      <w:r>
+        <w:t xml:space="preserve">: Masuk ke section</w:t>
+      </w:r>
+      <w:r>
+        <w:t xml:space="preserve"> </w:t>
+      </w:r>
+      <w:r>
+        <w:rPr>
+          <w:i/>
+          <w:iCs/>
+        </w:rPr>
+        <w:t xml:space="preserve">Produk Statistik &amp; SOP</w:t>
+      </w:r>
+      <w:r>
+        <w:t xml:space="preserve">, klik</w:t>
+      </w:r>
+      <w:r>
+        <w:t xml:space="preserve"> </w:t>
+      </w:r>
+      <w:r>
+        <w:rPr>
+          <w:b/>
+          <w:bCs/>
+        </w:rPr>
+        <w:t xml:space="preserve">“Unduh Monografi”</w:t>
+      </w:r>
+      <w:r>
+        <w:t xml:space="preserve"> </w:t>
+      </w:r>
+      <w:r>
+        <w:t xml:space="preserve">atau</w:t>
+      </w:r>
+      <w:r>
+        <w:t xml:space="preserve"> </w:t>
+      </w:r>
+      <w:r>
+        <w:rPr>
+          <w:b/>
+          <w:bCs/>
+        </w:rPr>
+        <w:t xml:space="preserve">“Unduh Versi HD”</w:t>
+      </w:r>
+      <w:r>
+        <w:t xml:space="preserve"> </w:t>
+      </w:r>
+      <w:r>
+        <w:t xml:space="preserve">untuk materi infografis visual.</w:t>
+      </w:r>
+    </w:p>
+    <w:p>
+      <w:pPr>
+        <w:pStyle w:val="Compact"/>
+        <w:numPr>
+          <w:ilvl w:val="0"/>
+          <w:numId w:val="1002"/>
+        </w:numPr>
+      </w:pPr>
+      <w:r>
+        <w:rPr>
+          <w:b/>
+          <w:bCs/>
+        </w:rPr>
+        <w:t xml:space="preserve">Integrasi Open API (Bagi Pengembang / Sistem Eksternal)</w:t>
+      </w:r>
+      <w:r>
+        <w:t xml:space="preserve">:</w:t>
+      </w:r>
+    </w:p>
+    <w:p>
+      <w:pPr>
+        <w:pStyle w:val="Compact"/>
+        <w:numPr>
+          <w:ilvl w:val="1"/>
+          <w:numId w:val="1005"/>
+        </w:numPr>
+      </w:pPr>
+      <w:r>
+        <w:t xml:space="preserve">Akses data terbuka terstruktur via REST API (JSON):</w:t>
       </w:r>
     </w:p>
     <w:p>
@@ -820,29 +895,20 @@
         <w:pStyle w:val="Compact"/>
         <w:numPr>
           <w:ilvl w:val="2"/>
-          <w:numId w:val="1005"/>
+          <w:numId w:val="1006"/>
         </w:numPr>
       </w:pPr>
       <w:r>
         <w:rPr>
           <w:rStyle w:val="VerbatimChar"/>
         </w:rPr>
-        <w:t xml:space="preserve">GET https://desa-sm.dvlp.asia/desa-cantik/api/pasirpalembang/Sheet1</w:t>
-      </w:r>
-    </w:p>
-    <w:p>
-      <w:pPr>
-        <w:pStyle w:val="Compact"/>
-        <w:numPr>
-          <w:ilvl w:val="2"/>
-          <w:numId w:val="1005"/>
-        </w:numPr>
-      </w:pPr>
-      <w:r>
-        <w:rPr>
-          <w:rStyle w:val="VerbatimChar"/>
-        </w:rPr>
-        <w:t xml:space="preserve">GET https://desa-sm.dvlp.asia/desa-cantik/api/pasirpalembang/Sheet4</w:t>
+        <w:t xml:space="preserve">https://desa-sm.dvlp.asia/desa-cantik/api/pasirpalembang</w:t>
+      </w:r>
+      <w:r>
+        <w:t xml:space="preserve"> </w:t>
+      </w:r>
+      <w:r>
+        <w:t xml:space="preserve">(format JSON terstandarisasi untuk integrasi aplikasi).</w:t>
       </w:r>
     </w:p>
     <w:p>
@@ -853,13 +919,13 @@
       </w:r>
     </w:p>
     <w:bookmarkEnd w:id="23"/>
-    <w:bookmarkStart w:id="24" w:name="Xa86077975dfcab438550800e30692ac0c356316"/>
+    <w:bookmarkStart w:id="24" w:name="Xb3c7f9e024640bd64cd0498921afc643016a832"/>
     <w:p>
       <w:pPr>
         <w:pStyle w:val="Heading4"/>
       </w:pPr>
       <w:r>
-        <w:t xml:space="preserve">B. Jalur 2: Layanan Fasilitasi / Permintaan Khusus (</w:t>
+        <w:t xml:space="preserve">B. Jalur 2: Layanan Fasilitasi Cepat (</w:t>
       </w:r>
       <w:r>
         <w:rPr>
@@ -869,7 +935,7 @@
         <w:t xml:space="preserve">Offline &amp; WhatsApp</w:t>
       </w:r>
       <w:r>
-        <w:t xml:space="preserve">) — Maksimal 1 Hari Kerja</w:t>
+        <w:t xml:space="preserve">) — 15 s.d. 30 Menit</w:t>
       </w:r>
     </w:p>
     <w:p>
@@ -877,7 +943,7 @@
         <w:pStyle w:val="FirstParagraph"/>
       </w:pPr>
       <w:r>
-        <w:t xml:space="preserve">Jalur ini ditujukan bagi pemohon yang membutuhkan data disagregasi khusus, konsultasi statistik sektoral, atau berkas data bertanda tangan resmi Kepala Desa Pasir Palembang:</w:t>
+        <w:t xml:space="preserve">Jalur ini ditujukan bagi pemohon yang memerlukan data disagregasi agregat khusus atau bantuan konsultasi teknis statistik, diproses langsung secara cepat oleh Petugas Agen Statistik Desa:</w:t>
       </w:r>
     </w:p>
     <w:tbl>
@@ -996,7 +1062,7 @@
               <w:jc w:val="left"/>
             </w:pPr>
             <w:r>
-              <w:t xml:space="preserve">Mengajukan permohonan di loket Kantor Desa Pasir Palembang atau menghubungi Agen Statistik Desa via WhatsApp (</w:t>
+              <w:t xml:space="preserve">Mengajukan kebutuhan data agregat di loket Kantor Desa Pasir Palembang atau via WhatsApp Agen Statistik (</w:t>
             </w:r>
             <w:r>
               <w:rPr>
@@ -1005,7 +1071,7 @@
               <w:t xml:space="preserve">+62 857-5171-8089</w:t>
             </w:r>
             <w:r>
-              <w:t xml:space="preserve">) dengan menyampaikan maksud keperluan.</w:t>
+              <w:t xml:space="preserve">).</w:t>
             </w:r>
           </w:p>
         </w:tc>
@@ -1017,7 +1083,7 @@
               <w:jc w:val="center"/>
             </w:pPr>
             <w:r>
-              <w:t xml:space="preserve">10 Menit</w:t>
+              <w:t xml:space="preserve">5 Menit</w:t>
             </w:r>
           </w:p>
         </w:tc>
@@ -1029,7 +1095,7 @@
               <w:jc w:val="left"/>
             </w:pPr>
             <w:r>
-              <w:t xml:space="preserve">Formulir Permohonan Tercatat</w:t>
+              <w:t xml:space="preserve">Permohonan Tercatat</w:t>
             </w:r>
           </w:p>
         </w:tc>
@@ -1059,7 +1125,7 @@
               <w:jc w:val="left"/>
             </w:pPr>
             <w:r>
-              <w:t xml:space="preserve">Kasi Pemerintahan / Kepala Desa Pasir Palembang</w:t>
+              <w:t xml:space="preserve">Agen Statistik Desa</w:t>
             </w:r>
           </w:p>
         </w:tc>
@@ -1071,7 +1137,17 @@
               <w:jc w:val="left"/>
             </w:pPr>
             <w:r>
-              <w:t xml:space="preserve">Memverifikasi kesesuaian permohonan data dan memberikan persetujuan rilis data statistik.</w:t>
+              <w:t xml:space="preserve">Memverifikasi bahwa data yang diminta adalah data agregat (non-</w:t>
+            </w:r>
+            <w:r>
+              <w:rPr>
+                <w:i/>
+                <w:iCs/>
+              </w:rPr>
+              <w:t xml:space="preserve">by name by address</w:t>
+            </w:r>
+            <w:r>
+              <w:t xml:space="preserve">).</w:t>
             </w:r>
           </w:p>
         </w:tc>
@@ -1083,7 +1159,7 @@
               <w:jc w:val="center"/>
             </w:pPr>
             <w:r>
-              <w:t xml:space="preserve">Maks 2 Jam</w:t>
+              <w:t xml:space="preserve">5 Menit</w:t>
             </w:r>
           </w:p>
         </w:tc>
@@ -1095,7 +1171,7 @@
               <w:jc w:val="left"/>
             </w:pPr>
             <w:r>
-              <w:t xml:space="preserve">Disposisi Persetujuan Rilis</w:t>
+              <w:t xml:space="preserve">Permohonan Terverifikasi</w:t>
             </w:r>
           </w:p>
         </w:tc>
@@ -1137,7 +1213,7 @@
               <w:jc w:val="left"/>
             </w:pPr>
             <w:r>
-              <w:t xml:space="preserve">Melakukan ekstraksi data dari basis data terpadu Desa Cantik.</w:t>
+              <w:t xml:space="preserve">Melakukan ekstraksi rekapitulasi data dari basis data terpadu Desa Cantik.</w:t>
             </w:r>
           </w:p>
         </w:tc>
@@ -1149,7 +1225,7 @@
               <w:jc w:val="center"/>
             </w:pPr>
             <w:r>
-              <w:t xml:space="preserve">15 Menit</w:t>
+              <w:t xml:space="preserve">10 Menit</w:t>
             </w:r>
           </w:p>
         </w:tc>
@@ -1203,7 +1279,7 @@
               <w:jc w:val="left"/>
             </w:pPr>
             <w:r>
-              <w:t xml:space="preserve">Menyerahkan berkas data resmi (cetak bertanda tangan atau file elektronik terotentikasi via WhatsApp/Email).</w:t>
+              <w:t xml:space="preserve">Menyerahkan lembar rekapitulasi data terverifikasi (file digital via WhatsApp/Email atau cetak langsung).</w:t>
             </w:r>
           </w:p>
         </w:tc>
@@ -1227,7 +1303,7 @@
               <w:jc w:val="left"/>
             </w:pPr>
             <w:r>
-              <w:t xml:space="preserve">Tanda Terima &amp; Berkas Data</w:t>
+              <w:t xml:space="preserve">Data Selesai Diterima</w:t>
             </w:r>
           </w:p>
         </w:tc>
@@ -1256,7 +1332,7 @@
         <w:pStyle w:val="Compact"/>
         <w:numPr>
           <w:ilvl w:val="0"/>
-          <w:numId w:val="1006"/>
+          <w:numId w:val="1007"/>
         </w:numPr>
       </w:pPr>
       <w:r>
@@ -1264,22 +1340,22 @@
           <w:b/>
           <w:bCs/>
         </w:rPr>
-        <w:t xml:space="preserve">Perlindungan Data Pribadi (UU No. 27/2022)</w:t>
-      </w:r>
-      <w:r>
-        <w:t xml:space="preserve">: Data individu/mikro (</w:t>
-      </w:r>
-      <w:r>
-        <w:rPr>
+        <w:t xml:space="preserve">Wajib Non-</w:t>
+      </w:r>
+      <w:r>
+        <w:rPr>
+          <w:b/>
+          <w:bCs/>
           <w:i/>
           <w:iCs/>
         </w:rPr>
-        <w:t xml:space="preserve">by name by address</w:t>
-      </w:r>
-      <w:r>
-        <w:t xml:space="preserve">) bersifat rahasia dan</w:t>
-      </w:r>
-      <w:r>
+        <w:t xml:space="preserve">By Name By Address</w:t>
+      </w:r>
+      <w:r>
+        <w:rPr>
+          <w:b/>
+          <w:bCs/>
+        </w:rPr>
         <w:t xml:space="preserve"> </w:t>
       </w:r>
       <w:r>
@@ -1287,13 +1363,26 @@
           <w:b/>
           <w:bCs/>
         </w:rPr>
-        <w:t xml:space="preserve">tidak dipublikasikan</w:t>
+        <w:t xml:space="preserve">(UU No. 27/2022)</w:t>
+      </w:r>
+      <w:r>
+        <w:t xml:space="preserve">: Data individu/mikro perorangan dan identitas keluarga bersifat rahasia dan</w:t>
       </w:r>
       <w:r>
         <w:t xml:space="preserve"> </w:t>
       </w:r>
       <w:r>
-        <w:t xml:space="preserve">untuk melindungi privasi warga.</w:t>
+        <w:rPr>
+          <w:b/>
+          <w:bCs/>
+        </w:rPr>
+        <w:t xml:space="preserve">sama sekali tidak dapat diberikan kepada pemohon manapun</w:t>
+      </w:r>
+      <w:r>
+        <w:t xml:space="preserve"> </w:t>
+      </w:r>
+      <w:r>
+        <w:t xml:space="preserve">guna melindungi data pribadi penduduk.</w:t>
       </w:r>
     </w:p>
     <w:p>
@@ -1301,7 +1390,7 @@
         <w:pStyle w:val="Compact"/>
         <w:numPr>
           <w:ilvl w:val="0"/>
-          <w:numId w:val="1006"/>
+          <w:numId w:val="1007"/>
         </w:numPr>
       </w:pPr>
       <w:r>
@@ -1309,10 +1398,10 @@
           <w:b/>
           <w:bCs/>
         </w:rPr>
-        <w:t xml:space="preserve">Level Diseminasi</w:t>
-      </w:r>
-      <w:r>
-        <w:t xml:space="preserve">: Data yang diserahkan kepada publik berupa data agregat tingkat Rukun Tetangga (RT), Dusun/RW, atau inventarisasi fasilitas umum.</w:t>
+        <w:t xml:space="preserve">Level Diseminasi Legal</w:t>
+      </w:r>
+      <w:r>
+        <w:t xml:space="preserve">: Data yang dapat dilayani murni merupakan data agregat/makro tingkat Rukun Tetangga (RT), Dusun/RW, desa/kelurahan, atau sebaran fasilitas umum.</w:t>
       </w:r>
     </w:p>
     <w:p>
@@ -1320,7 +1409,7 @@
         <w:pStyle w:val="Compact"/>
         <w:numPr>
           <w:ilvl w:val="0"/>
-          <w:numId w:val="1006"/>
+          <w:numId w:val="1007"/>
         </w:numPr>
       </w:pPr>
       <w:r>
@@ -1328,10 +1417,10 @@
           <w:b/>
           <w:bCs/>
         </w:rPr>
-        <w:t xml:space="preserve">Pemanfaatan Non-Komersial</w:t>
-      </w:r>
-      <w:r>
-        <w:t xml:space="preserve">: Data hasil kegiatan Desa Cantik disediakan untuk kepentingan perencanaan pembangunan, perumusan kebijakan, penelitian akademis, dan pelayanan publik. Penggunaan untuk tujuan komersial wajib memperoleh izin tertulis dari Pemerintah Desa.</w:t>
+        <w:t xml:space="preserve">Pemanfaatan Data</w:t>
+      </w:r>
+      <w:r>
+        <w:t xml:space="preserve">: Data hasil pembinaan Desa Cantik disediakan untuk perencanaan pembangunan, riset akademik, evaluasi program, dan perumusan kebijakan publik. Penggunaan untuk tujuan komersial wajib memperoleh izin tertulis dari Pemerintah Desa.</w:t>
       </w:r>
     </w:p>
     <w:p>
@@ -1342,13 +1431,13 @@
       </w:r>
     </w:p>
     <w:bookmarkEnd w:id="26"/>
-    <w:bookmarkStart w:id="27" w:name="pengesahan-tanda-tangan"/>
+    <w:bookmarkStart w:id="27" w:name="pengesahan-dokumen-sop"/>
     <w:p>
       <w:pPr>
         <w:pStyle w:val="Heading3"/>
       </w:pPr>
       <w:r>
-        <w:t xml:space="preserve">6. Pengesahan &amp; Tanda Tangan</w:t>
+        <w:t xml:space="preserve">6. Pengesahan Dokumen SOP</w:t>
       </w:r>
     </w:p>
     <w:p>
@@ -1368,7 +1457,7 @@
           <w:b/>
           <w:bCs/>
         </w:rPr>
-        <w:t xml:space="preserve">Mengesahkan,</w:t>
+        <w:t xml:space="preserve">Menetapkan,</w:t>
       </w:r>
       <w:r>
         <w:br/>
@@ -1511,6 +1600,109 @@
       </w:pPr>
     </w:lvl>
   </w:abstractNum>
+  <w:abstractNum w:abstractNumId="991">
+    <w:nsid w:val="0000A991"/>
+    <w:multiLevelType w:val="multilevel"/>
+    <w:lvl w:ilvl="0">
+      <w:numFmt w:val="bullet"/>
+      <w:lvlText w:val=""/>
+      <w:lvlJc w:val="left"/>
+      <w:pPr>
+        <w:ind w:left="720" w:hanging="360"/>
+      </w:pPr>
+      <w:rPr>
+        <w:rFonts w:ascii="Symbol" w:hAnsi="Symbol" w:cs="Symbol" w:hint="default"/>
+      </w:rPr>
+    </w:lvl>
+    <w:lvl w:ilvl="1">
+      <w:numFmt w:val="bullet"/>
+      <w:lvlText w:val="o"/>
+      <w:lvlJc w:val="left"/>
+      <w:pPr>
+        <w:ind w:left="1440" w:hanging="360"/>
+      </w:pPr>
+      <w:rPr>
+        <w:rFonts w:ascii="Courier New" w:hAnsi="Courier New" w:cs="Courier New" w:hint="default"/>
+      </w:rPr>
+    </w:lvl>
+    <w:lvl w:ilvl="2">
+      <w:numFmt w:val="bullet"/>
+      <w:lvlText w:val=""/>
+      <w:lvlJc w:val="left"/>
+      <w:pPr>
+        <w:ind w:left="2160" w:hanging="360"/>
+      </w:pPr>
+      <w:rPr>
+        <w:rFonts w:ascii="Wingdings" w:hAnsi="Wingdings" w:cs="Wingdings" w:hint="default"/>
+      </w:rPr>
+    </w:lvl>
+    <w:lvl w:ilvl="3">
+      <w:numFmt w:val="bullet"/>
+      <w:lvlText w:val=""/>
+      <w:lvlJc w:val="left"/>
+      <w:pPr>
+        <w:ind w:left="2880" w:hanging="360"/>
+      </w:pPr>
+      <w:rPr>
+        <w:rFonts w:ascii="Symbol" w:hAnsi="Symbol" w:cs="Symbol" w:hint="default"/>
+      </w:rPr>
+    </w:lvl>
+    <w:lvl w:ilvl="4">
+      <w:numFmt w:val="bullet"/>
+      <w:lvlText w:val="o"/>
+      <w:lvlJc w:val="left"/>
+      <w:pPr>
+        <w:ind w:left="3600" w:hanging="360"/>
+      </w:pPr>
+      <w:rPr>
+        <w:rFonts w:ascii="Courier New" w:hAnsi="Courier New" w:cs="Courier New" w:hint="default"/>
+      </w:rPr>
+    </w:lvl>
+    <w:lvl w:ilvl="5">
+      <w:numFmt w:val="bullet"/>
+      <w:lvlText w:val=""/>
+      <w:lvlJc w:val="left"/>
+      <w:pPr>
+        <w:ind w:left="4320" w:hanging="360"/>
+      </w:pPr>
+      <w:rPr>
+        <w:rFonts w:ascii="Wingdings" w:hAnsi="Wingdings" w:cs="Wingdings" w:hint="default"/>
+      </w:rPr>
+    </w:lvl>
+    <w:lvl w:ilvl="6">
+      <w:numFmt w:val="bullet"/>
+      <w:lvlText w:val=""/>
+      <w:lvlJc w:val="left"/>
+      <w:pPr>
+        <w:ind w:left="5040" w:hanging="360"/>
+      </w:pPr>
+      <w:rPr>
+        <w:rFonts w:ascii="Symbol" w:hAnsi="Symbol" w:cs="Symbol" w:hint="default"/>
+      </w:rPr>
+    </w:lvl>
+    <w:lvl w:ilvl="7">
+      <w:numFmt w:val="bullet"/>
+      <w:lvlText w:val="o"/>
+      <w:lvlJc w:val="left"/>
+      <w:pPr>
+        <w:ind w:left="5760" w:hanging="360"/>
+      </w:pPr>
+      <w:rPr>
+        <w:rFonts w:ascii="Courier New" w:hAnsi="Courier New" w:cs="Courier New" w:hint="default"/>
+      </w:rPr>
+    </w:lvl>
+    <w:lvl w:ilvl="8">
+      <w:numFmt w:val="bullet"/>
+      <w:lvlText w:val=""/>
+      <w:lvlJc w:val="left"/>
+      <w:pPr>
+        <w:ind w:left="6480" w:hanging="360"/>
+      </w:pPr>
+      <w:rPr>
+        <w:rFonts w:ascii="Wingdings" w:hAnsi="Wingdings" w:cs="Wingdings" w:hint="default"/>
+      </w:rPr>
+    </w:lvl>
+  </w:abstractNum>
   <w:abstractNum w:abstractNumId="99411">
     <w:nsid w:val="00A99411"/>
     <w:multiLevelType w:val="multilevel"/>
@@ -1596,113 +1788,13 @@
       </w:pPr>
     </w:lvl>
   </w:abstractNum>
-  <w:abstractNum w:abstractNumId="991">
-    <w:nsid w:val="0000A991"/>
-    <w:multiLevelType w:val="multilevel"/>
-    <w:lvl w:ilvl="0">
-      <w:numFmt w:val="bullet"/>
-      <w:lvlText w:val=""/>
-      <w:lvlJc w:val="left"/>
-      <w:pPr>
-        <w:ind w:left="720" w:hanging="360"/>
-      </w:pPr>
-      <w:rPr>
-        <w:rFonts w:ascii="Symbol" w:hAnsi="Symbol" w:cs="Symbol" w:hint="default"/>
-      </w:rPr>
-    </w:lvl>
-    <w:lvl w:ilvl="1">
-      <w:numFmt w:val="bullet"/>
-      <w:lvlText w:val="o"/>
-      <w:lvlJc w:val="left"/>
-      <w:pPr>
-        <w:ind w:left="1440" w:hanging="360"/>
-      </w:pPr>
-      <w:rPr>
-        <w:rFonts w:ascii="Courier New" w:hAnsi="Courier New" w:cs="Courier New" w:hint="default"/>
-      </w:rPr>
-    </w:lvl>
-    <w:lvl w:ilvl="2">
-      <w:numFmt w:val="bullet"/>
-      <w:lvlText w:val=""/>
-      <w:lvlJc w:val="left"/>
-      <w:pPr>
-        <w:ind w:left="2160" w:hanging="360"/>
-      </w:pPr>
-      <w:rPr>
-        <w:rFonts w:ascii="Wingdings" w:hAnsi="Wingdings" w:cs="Wingdings" w:hint="default"/>
-      </w:rPr>
-    </w:lvl>
-    <w:lvl w:ilvl="3">
-      <w:numFmt w:val="bullet"/>
-      <w:lvlText w:val=""/>
-      <w:lvlJc w:val="left"/>
-      <w:pPr>
-        <w:ind w:left="2880" w:hanging="360"/>
-      </w:pPr>
-      <w:rPr>
-        <w:rFonts w:ascii="Symbol" w:hAnsi="Symbol" w:cs="Symbol" w:hint="default"/>
-      </w:rPr>
-    </w:lvl>
-    <w:lvl w:ilvl="4">
-      <w:numFmt w:val="bullet"/>
-      <w:lvlText w:val="o"/>
-      <w:lvlJc w:val="left"/>
-      <w:pPr>
-        <w:ind w:left="3600" w:hanging="360"/>
-      </w:pPr>
-      <w:rPr>
-        <w:rFonts w:ascii="Courier New" w:hAnsi="Courier New" w:cs="Courier New" w:hint="default"/>
-      </w:rPr>
-    </w:lvl>
-    <w:lvl w:ilvl="5">
-      <w:numFmt w:val="bullet"/>
-      <w:lvlText w:val=""/>
-      <w:lvlJc w:val="left"/>
-      <w:pPr>
-        <w:ind w:left="4320" w:hanging="360"/>
-      </w:pPr>
-      <w:rPr>
-        <w:rFonts w:ascii="Wingdings" w:hAnsi="Wingdings" w:cs="Wingdings" w:hint="default"/>
-      </w:rPr>
-    </w:lvl>
-    <w:lvl w:ilvl="6">
-      <w:numFmt w:val="bullet"/>
-      <w:lvlText w:val=""/>
-      <w:lvlJc w:val="left"/>
-      <w:pPr>
-        <w:ind w:left="5040" w:hanging="360"/>
-      </w:pPr>
-      <w:rPr>
-        <w:rFonts w:ascii="Symbol" w:hAnsi="Symbol" w:cs="Symbol" w:hint="default"/>
-      </w:rPr>
-    </w:lvl>
-    <w:lvl w:ilvl="7">
-      <w:numFmt w:val="bullet"/>
-      <w:lvlText w:val="o"/>
-      <w:lvlJc w:val="left"/>
-      <w:pPr>
-        <w:ind w:left="5760" w:hanging="360"/>
-      </w:pPr>
-      <w:rPr>
-        <w:rFonts w:ascii="Courier New" w:hAnsi="Courier New" w:cs="Courier New" w:hint="default"/>
-      </w:rPr>
-    </w:lvl>
-    <w:lvl w:ilvl="8">
-      <w:numFmt w:val="bullet"/>
-      <w:lvlText w:val=""/>
-      <w:lvlJc w:val="left"/>
-      <w:pPr>
-        <w:ind w:left="6480" w:hanging="360"/>
-      </w:pPr>
-      <w:rPr>
-        <w:rFonts w:ascii="Wingdings" w:hAnsi="Wingdings" w:cs="Wingdings" w:hint="default"/>
-      </w:rPr>
-    </w:lvl>
-  </w:abstractNum>
   <w:num w:numId="1000">
     <w:abstractNumId w:val="990"/>
   </w:num>
   <w:num w:numId="1001">
+    <w:abstractNumId w:val="991"/>
+  </w:num>
+  <w:num w:numId="1002">
     <w:abstractNumId w:val="99411"/>
     <w:lvlOverride w:ilvl="0">
       <w:startOverride w:val="1"/>
@@ -1732,9 +1824,6 @@
       <w:startOverride w:val="1"/>
     </w:lvlOverride>
   </w:num>
-  <w:num w:numId="1002">
-    <w:abstractNumId w:val="991"/>
-  </w:num>
   <w:num w:numId="1003">
     <w:abstractNumId w:val="991"/>
   </w:num>
@@ -1745,6 +1834,9 @@
     <w:abstractNumId w:val="991"/>
   </w:num>
   <w:num w:numId="1006">
+    <w:abstractNumId w:val="991"/>
+  </w:num>
+  <w:num w:numId="1007">
     <w:abstractNumId w:val="99411"/>
     <w:lvlOverride w:ilvl="0">
       <w:startOverride w:val="1"/>

</xml_diff>